<commit_message>
docs: agregar diagramas y estructura de datos al anteproyecto
Nueva sección 5 (Estructura de datos) con el modelo de entidades basado
en las migraciones reales, más tres diagramas: esquema de
funcionamiento, modelo entidad-relación y circuito de la información.
Se incluyen los PNG fuente en docs/presentacion/diagramas.

Co-Authored-By: Claude Fable 5 <noreply@anthropic.com>
Claude-Session: https://claude.ai/code/session_01PXFtVC1rBgo8dCza5yvnRY
</commit_message>
<xml_diff>
--- a/docs/presentacion/ARDIP - Anteproyecto del Sistema.docx
+++ b/docs/presentacion/ARDIP - Anteproyecto del Sistema.docx
@@ -290,6 +290,68 @@
           <w:szCs w:val="22"/>
         </w:rPr>
         <w:t xml:space="preserve">El diseño se apoya en tecnologías de uso masivo y probado (Laravel, MySQL, arquitectura web estándar), lo que garantiza mantenimiento sencillo, posibilidad de crecimiento por módulos y costo cero en licencias de software.</w:t>
+      </w:r>
+    </w:p>
+    <w:p>
+      <w:pPr>
+        <w:spacing w:after="60" w:before="120"/>
+        <w:jc w:val="center"/>
+      </w:pPr>
+      <w:r>
+        <w:drawing>
+          <wp:inline distT="0" distB="0" distL="0" distR="0">
+            <wp:extent cx="5905500" cy="2428875"/>
+            <wp:effectExtent t="0" r="0" b="0" l="0"/>
+            <wp:docPr id="1" name="" descr="" title=""/>
+            <wp:cNvGraphicFramePr>
+              <a:graphicFrameLocks xmlns:a="http://schemas.openxmlformats.org/drawingml/2006/main" noChangeAspect="1"/>
+            </wp:cNvGraphicFramePr>
+            <a:graphic xmlns:a="http://schemas.openxmlformats.org/drawingml/2006/main">
+              <a:graphicData uri="http://schemas.openxmlformats.org/drawingml/2006/picture">
+                <pic:pic xmlns:pic="http://schemas.openxmlformats.org/drawingml/2006/picture">
+                  <pic:nvPicPr>
+                    <pic:cNvPr id="0" name="" descr=""/>
+                    <pic:cNvPicPr>
+                      <a:picLocks noChangeAspect="1" noChangeArrowheads="1"/>
+                    </pic:cNvPicPr>
+                  </pic:nvPicPr>
+                  <pic:blipFill>
+                    <a:blip r:embed="rId7" cstate="none"/>
+                    <a:srcRect/>
+                    <a:stretch>
+                      <a:fillRect/>
+                    </a:stretch>
+                  </pic:blipFill>
+                  <pic:spPr bwMode="auto">
+                    <a:xfrm>
+                      <a:off x="0" y="0"/>
+                      <a:ext cx="5905500" cy="2428875"/>
+                    </a:xfrm>
+                    <a:prstGeom prst="rect">
+                      <a:avLst/>
+                    </a:prstGeom>
+                  </pic:spPr>
+                </pic:pic>
+              </a:graphicData>
+            </a:graphic>
+          </wp:inline>
+        </w:drawing>
+      </w:r>
+    </w:p>
+    <w:p>
+      <w:pPr>
+        <w:spacing w:after="200"/>
+        <w:jc w:val="center"/>
+      </w:pPr>
+      <w:r>
+        <w:rPr>
+          <w:i/>
+          <w:iCs/>
+          <w:color w:val="595959"/>
+          <w:sz w:val="18"/>
+          <w:szCs w:val="18"/>
+        </w:rPr>
+        <w:t xml:space="preserve">Figura 1 – Esquema de funcionamiento: los usuarios acceden por red interna al servidor, que concentra la base de datos y la auditoría.</w:t>
       </w:r>
     </w:p>
     <w:p>
@@ -799,7 +861,7 @@
           <w:sz w:val="28"/>
           <w:szCs w:val="28"/>
         </w:rPr>
-        <w:t xml:space="preserve">5. El valor central: información acumulativa y vinculada</w:t>
+        <w:t xml:space="preserve">5. Estructura de datos</w:t>
       </w:r>
     </w:p>
     <w:p>
@@ -812,7 +874,82 @@
           <w:sz w:val="22"/>
           <w:szCs w:val="22"/>
         </w:rPr>
-        <w:t xml:space="preserve">La característica que distingue a ARDIP de una simple planilla es que ningún dato queda aislado. Cada persona, domicilio, procedimiento y documento se relaciona con los demás, y esas relaciones se conservan en el tiempo. En la práctica, esto significa que:</w:t>
+        <w:t xml:space="preserve">El corazón del diseño es su modelo de datos: define qué se registra de cada entidad y, sobre todo, cómo se relacionan entre sí. El siguiente esquema resume las entidades principales y sus vínculos:</w:t>
+      </w:r>
+    </w:p>
+    <w:p>
+      <w:pPr>
+        <w:spacing w:after="60" w:before="120"/>
+        <w:jc w:val="center"/>
+      </w:pPr>
+      <w:r>
+        <w:drawing>
+          <wp:inline distT="0" distB="0" distL="0" distR="0">
+            <wp:extent cx="5905500" cy="3990975"/>
+            <wp:effectExtent t="0" r="0" b="0" l="0"/>
+            <wp:docPr id="1" name="" descr="" title=""/>
+            <wp:cNvGraphicFramePr>
+              <a:graphicFrameLocks xmlns:a="http://schemas.openxmlformats.org/drawingml/2006/main" noChangeAspect="1"/>
+            </wp:cNvGraphicFramePr>
+            <a:graphic xmlns:a="http://schemas.openxmlformats.org/drawingml/2006/main">
+              <a:graphicData uri="http://schemas.openxmlformats.org/drawingml/2006/picture">
+                <pic:pic xmlns:pic="http://schemas.openxmlformats.org/drawingml/2006/picture">
+                  <pic:nvPicPr>
+                    <pic:cNvPr id="0" name="" descr=""/>
+                    <pic:cNvPicPr>
+                      <a:picLocks noChangeAspect="1" noChangeArrowheads="1"/>
+                    </pic:cNvPicPr>
+                  </pic:nvPicPr>
+                  <pic:blipFill>
+                    <a:blip r:embed="rId8" cstate="none"/>
+                    <a:srcRect/>
+                    <a:stretch>
+                      <a:fillRect/>
+                    </a:stretch>
+                  </pic:blipFill>
+                  <pic:spPr bwMode="auto">
+                    <a:xfrm>
+                      <a:off x="0" y="0"/>
+                      <a:ext cx="5905500" cy="3990975"/>
+                    </a:xfrm>
+                    <a:prstGeom prst="rect">
+                      <a:avLst/>
+                    </a:prstGeom>
+                  </pic:spPr>
+                </pic:pic>
+              </a:graphicData>
+            </a:graphic>
+          </wp:inline>
+        </w:drawing>
+      </w:r>
+    </w:p>
+    <w:p>
+      <w:pPr>
+        <w:spacing w:after="200"/>
+        <w:jc w:val="center"/>
+      </w:pPr>
+      <w:r>
+        <w:rPr>
+          <w:i/>
+          <w:iCs/>
+          <w:color w:val="595959"/>
+          <w:sz w:val="18"/>
+          <w:szCs w:val="18"/>
+        </w:rPr>
+        <w:t xml:space="preserve">Figura 2 – Modelo de entidades y relaciones del sistema (simplificado).</w:t>
+      </w:r>
+    </w:p>
+    <w:p>
+      <w:pPr>
+        <w:spacing w:after="160" w:line="300"/>
+        <w:jc w:val="both"/>
+      </w:pPr>
+      <w:r>
+        <w:rPr>
+          <w:sz w:val="22"/>
+          <w:szCs w:val="22"/>
+        </w:rPr>
+        <w:t xml:space="preserve">Los puntos clave de esta estructura, explicados en lenguaje llano:</w:t>
       </w:r>
     </w:p>
     <w:p>
@@ -829,7 +966,7 @@
           <w:sz w:val="22"/>
           <w:szCs w:val="22"/>
         </w:rPr>
-        <w:t xml:space="preserve">Al cargar una nueva actuación, el sistema permite verificar de inmediato si las personas o domicilios involucrados ya registran antecedentes de carga en otras actuaciones.</w:t>
+        <w:t xml:space="preserve">Una persona puede tener varios alias, varios domicilios y figurar en varios procedimientos; y a la inversa, un procedimiento o un domicilio pueden involucrar a varias personas. Estas relaciones “de muchos a muchos” son las que permiten los cruces de información.</w:t>
       </w:r>
     </w:p>
     <w:p>
@@ -846,7 +983,7 @@
           <w:sz w:val="22"/>
           <w:szCs w:val="22"/>
         </w:rPr>
-        <w:t xml:space="preserve">La ficha de una persona muestra su historial completo: alias, fotografías, documentación, domicilios utilizados a lo largo del tiempo y procedimientos en los que fue vinculada.</w:t>
+        <w:t xml:space="preserve">El vínculo entre una persona y un procedimiento no es un simple tilde: guarda la situación procesal (detenido, notificado, no hallado) y si registra pedido de captura.</w:t>
       </w:r>
     </w:p>
     <w:p>
@@ -863,7 +1000,7 @@
           <w:sz w:val="22"/>
           <w:szCs w:val="22"/>
         </w:rPr>
-        <w:t xml:space="preserve">Un domicilio conserva el registro de todas las personas y actuaciones asociadas a él, aun cuando pertenezcan a causas distintas y distantes en el tiempo.</w:t>
+        <w:t xml:space="preserve">El vínculo entre una persona y un domicilio guarda el período (desde / hasta) y si se trata de su domicilio habitual, construyendo el historial de lugares que utilizó a lo largo del tiempo.</w:t>
       </w:r>
     </w:p>
     <w:p>
@@ -880,7 +1017,7 @@
           <w:sz w:val="22"/>
           <w:szCs w:val="22"/>
         </w:rPr>
-        <w:t xml:space="preserve">Las búsquedas por nombre, apodo, documento o dirección devuelven resultados en segundos, sobre toda la información histórica cargada.</w:t>
+        <w:t xml:space="preserve">Cada procedimiento registra su legajo fiscal, carátula, UFI y brigada interviniente, las órdenes libradas (allanamiento, secuestro, detención) y sus resultados, quedando asociado al usuario que lo cargó.</w:t>
       </w:r>
     </w:p>
     <w:p>
@@ -897,7 +1034,7 @@
           <w:sz w:val="22"/>
           <w:szCs w:val="22"/>
         </w:rPr>
-        <w:t xml:space="preserve">El sistema emite un aviso automático de coincidencia cuando se carga una persona, un alias o un domicilio que ya figura registrado en actuaciones anteriores, alertando al investigador de una posible conexión entre hechos.</w:t>
+        <w:t xml:space="preserve">Los domicilios guardan coordenadas geográficas, lo que habilita su visualización en mapa y el futuro análisis por zonas.</w:t>
       </w:r>
     </w:p>
     <w:p>
@@ -910,7 +1047,7 @@
           <w:sz w:val="22"/>
           <w:szCs w:val="22"/>
         </w:rPr>
-        <w:t xml:space="preserve">De esta forma, cada actuación que se carga no solo documenta un hecho: enriquece la base sobre la que se apoyarán las investigaciones siguientes. La información deja de perderse al cierre de cada causa y pasa a producir valor de manera permanente.</w:t>
+        <w:t xml:space="preserve">Esta estructura está definida a nivel de tablas, campos y claves en la documentación técnica del proyecto, lista para ser implementada en el motor de base de datos.</w:t>
       </w:r>
     </w:p>
     <w:p>
@@ -926,7 +1063,196 @@
           <w:sz w:val="28"/>
           <w:szCs w:val="28"/>
         </w:rPr>
-        <w:t xml:space="preserve">6. Seguridad, roles y auditoría</w:t>
+        <w:t xml:space="preserve">6. El valor central: información acumulativa y vinculada</w:t>
+      </w:r>
+    </w:p>
+    <w:p>
+      <w:pPr>
+        <w:spacing w:after="160" w:line="300"/>
+        <w:jc w:val="both"/>
+      </w:pPr>
+      <w:r>
+        <w:rPr>
+          <w:sz w:val="22"/>
+          <w:szCs w:val="22"/>
+        </w:rPr>
+        <w:t xml:space="preserve">La característica que distingue a ARDIP de una simple planilla es que ningún dato queda aislado. Cada persona, domicilio, procedimiento y documento se relaciona con los demás, y esas relaciones se conservan en el tiempo. En la práctica, esto significa que:</w:t>
+      </w:r>
+    </w:p>
+    <w:p>
+      <w:pPr>
+        <w:pStyle w:val="ListParagraph"/>
+        <w:numPr>
+          <w:ilvl w:val="0"/>
+          <w:numId w:val="2"/>
+        </w:numPr>
+        <w:spacing w:after="80"/>
+      </w:pPr>
+      <w:r>
+        <w:rPr>
+          <w:sz w:val="22"/>
+          <w:szCs w:val="22"/>
+        </w:rPr>
+        <w:t xml:space="preserve">Al cargar una nueva actuación, el sistema permite verificar de inmediato si las personas o domicilios involucrados ya registran antecedentes de carga en otras actuaciones.</w:t>
+      </w:r>
+    </w:p>
+    <w:p>
+      <w:pPr>
+        <w:pStyle w:val="ListParagraph"/>
+        <w:numPr>
+          <w:ilvl w:val="0"/>
+          <w:numId w:val="2"/>
+        </w:numPr>
+        <w:spacing w:after="80"/>
+      </w:pPr>
+      <w:r>
+        <w:rPr>
+          <w:sz w:val="22"/>
+          <w:szCs w:val="22"/>
+        </w:rPr>
+        <w:t xml:space="preserve">La ficha de una persona muestra su historial completo: alias, fotografías, documentación, domicilios utilizados a lo largo del tiempo y procedimientos en los que fue vinculada.</w:t>
+      </w:r>
+    </w:p>
+    <w:p>
+      <w:pPr>
+        <w:pStyle w:val="ListParagraph"/>
+        <w:numPr>
+          <w:ilvl w:val="0"/>
+          <w:numId w:val="2"/>
+        </w:numPr>
+        <w:spacing w:after="80"/>
+      </w:pPr>
+      <w:r>
+        <w:rPr>
+          <w:sz w:val="22"/>
+          <w:szCs w:val="22"/>
+        </w:rPr>
+        <w:t xml:space="preserve">Un domicilio conserva el registro de todas las personas y actuaciones asociadas a él, aun cuando pertenezcan a causas distintas y distantes en el tiempo.</w:t>
+      </w:r>
+    </w:p>
+    <w:p>
+      <w:pPr>
+        <w:pStyle w:val="ListParagraph"/>
+        <w:numPr>
+          <w:ilvl w:val="0"/>
+          <w:numId w:val="2"/>
+        </w:numPr>
+        <w:spacing w:after="80"/>
+      </w:pPr>
+      <w:r>
+        <w:rPr>
+          <w:sz w:val="22"/>
+          <w:szCs w:val="22"/>
+        </w:rPr>
+        <w:t xml:space="preserve">Las búsquedas por nombre, apodo, documento o dirección devuelven resultados en segundos, sobre toda la información histórica cargada.</w:t>
+      </w:r>
+    </w:p>
+    <w:p>
+      <w:pPr>
+        <w:pStyle w:val="ListParagraph"/>
+        <w:numPr>
+          <w:ilvl w:val="0"/>
+          <w:numId w:val="2"/>
+        </w:numPr>
+        <w:spacing w:after="80"/>
+      </w:pPr>
+      <w:r>
+        <w:rPr>
+          <w:sz w:val="22"/>
+          <w:szCs w:val="22"/>
+        </w:rPr>
+        <w:t xml:space="preserve">El sistema emite un aviso automático de coincidencia cuando se carga una persona, un alias o un domicilio que ya figura registrado en actuaciones anteriores, alertando al investigador de una posible conexión entre hechos.</w:t>
+      </w:r>
+    </w:p>
+    <w:p>
+      <w:pPr>
+        <w:spacing w:after="160" w:line="300"/>
+        <w:jc w:val="both"/>
+      </w:pPr>
+      <w:r>
+        <w:rPr>
+          <w:sz w:val="22"/>
+          <w:szCs w:val="22"/>
+        </w:rPr>
+        <w:t xml:space="preserve">De esta forma, cada actuación que se carga no solo documenta un hecho: enriquece la base sobre la que se apoyarán las investigaciones siguientes. La información deja de perderse al cierre de cada causa y pasa a producir valor de manera permanente.</w:t>
+      </w:r>
+    </w:p>
+    <w:p>
+      <w:pPr>
+        <w:spacing w:after="60" w:before="120"/>
+        <w:jc w:val="center"/>
+      </w:pPr>
+      <w:r>
+        <w:drawing>
+          <wp:inline distT="0" distB="0" distL="0" distR="0">
+            <wp:extent cx="5905500" cy="2705100"/>
+            <wp:effectExtent t="0" r="0" b="0" l="0"/>
+            <wp:docPr id="1" name="" descr="" title=""/>
+            <wp:cNvGraphicFramePr>
+              <a:graphicFrameLocks xmlns:a="http://schemas.openxmlformats.org/drawingml/2006/main" noChangeAspect="1"/>
+            </wp:cNvGraphicFramePr>
+            <a:graphic xmlns:a="http://schemas.openxmlformats.org/drawingml/2006/main">
+              <a:graphicData uri="http://schemas.openxmlformats.org/drawingml/2006/picture">
+                <pic:pic xmlns:pic="http://schemas.openxmlformats.org/drawingml/2006/picture">
+                  <pic:nvPicPr>
+                    <pic:cNvPr id="0" name="" descr=""/>
+                    <pic:cNvPicPr>
+                      <a:picLocks noChangeAspect="1" noChangeArrowheads="1"/>
+                    </pic:cNvPicPr>
+                  </pic:nvPicPr>
+                  <pic:blipFill>
+                    <a:blip r:embed="rId9" cstate="none"/>
+                    <a:srcRect/>
+                    <a:stretch>
+                      <a:fillRect/>
+                    </a:stretch>
+                  </pic:blipFill>
+                  <pic:spPr bwMode="auto">
+                    <a:xfrm>
+                      <a:off x="0" y="0"/>
+                      <a:ext cx="5905500" cy="2705100"/>
+                    </a:xfrm>
+                    <a:prstGeom prst="rect">
+                      <a:avLst/>
+                    </a:prstGeom>
+                  </pic:spPr>
+                </pic:pic>
+              </a:graphicData>
+            </a:graphic>
+          </wp:inline>
+        </w:drawing>
+      </w:r>
+    </w:p>
+    <w:p>
+      <w:pPr>
+        <w:spacing w:after="200"/>
+        <w:jc w:val="center"/>
+      </w:pPr>
+      <w:r>
+        <w:rPr>
+          <w:i/>
+          <w:iCs/>
+          <w:color w:val="595959"/>
+          <w:sz w:val="18"/>
+          <w:szCs w:val="18"/>
+        </w:rPr>
+        <w:t xml:space="preserve">Figura 3 – Circuito de la información: lo cargado en cada actuación queda disponible para todas las siguientes.</w:t>
+      </w:r>
+    </w:p>
+    <w:p>
+      <w:pPr>
+        <w:pStyle w:val="Heading1"/>
+        <w:spacing w:after="160" w:before="320"/>
+      </w:pPr>
+      <w:r>
+        <w:rPr>
+          <w:b/>
+          <w:bCs/>
+          <w:color w:val="1F3864"/>
+          <w:sz w:val="28"/>
+          <w:szCs w:val="28"/>
+        </w:rPr>
+        <w:t xml:space="preserve">7. Seguridad, roles y auditoría</w:t>
       </w:r>
     </w:p>
     <w:p>
@@ -1269,7 +1595,7 @@
           <w:sz w:val="28"/>
           <w:szCs w:val="28"/>
         </w:rPr>
-        <w:t xml:space="preserve">7. Líneas de evolución previstas</w:t>
+        <w:t xml:space="preserve">8. Líneas de evolución previstas</w:t>
       </w:r>
     </w:p>
     <w:p>
@@ -1451,7 +1777,7 @@
           <w:sz w:val="28"/>
           <w:szCs w:val="28"/>
         </w:rPr>
-        <w:t xml:space="preserve">8. Viabilidad</w:t>
+        <w:t xml:space="preserve">9. Viabilidad</w:t>
       </w:r>
     </w:p>
     <w:p>
@@ -1493,7 +1819,7 @@
           <w:sz w:val="28"/>
           <w:szCs w:val="28"/>
         </w:rPr>
-        <w:t xml:space="preserve">9. Conclusión</w:t>
+        <w:t xml:space="preserve">10. Conclusión</w:t>
       </w:r>
     </w:p>
     <w:p>

</xml_diff>

<commit_message>
docs: reescribir anteproyecto con texto revisado por el autor
Se incorpora la revisión manual del documento: se eliminan las
secciones de líneas de evolución, viabilidad y conclusión, se ajusta
la tabla de módulos (biblioteca digital con documentación real, sin
fila de catálogos) y se reescriben las funcionalidades en tiempo
futuro, como diseño a desarrollar.

Co-Authored-By: Claude Fable 5 <noreply@anthropic.com>
Claude-Session: https://claude.ai/code/session_01PXFtVC1rBgo8dCza5yvnRY
</commit_message>
<xml_diff>
--- a/docs/presentacion/ARDIP - Anteproyecto del Sistema.docx
+++ b/docs/presentacion/ARDIP - Anteproyecto del Sistema.docx
@@ -137,7 +137,7 @@
           <w:sz w:val="22"/>
           <w:szCs w:val="22"/>
         </w:rPr>
-        <w:t xml:space="preserve">El sistema propone centralizar en una única plataforma las fichas de personas, domicilios, procedimientos y documentación, mantenerlas vinculadas entre sí de manera permanente, y controlar mediante roles y auditoría quién accede a cada dato. El presente documento reúne el diseño funcional completo del sistema — sus módulos, la estructura de su base de datos y su esquema de seguridad — elaborado sobre tecnologías estándar y sin costos de licencias, de modo que el desarrollo puede encararse con recursos propios y de manera gradual.</w:t>
+        <w:t xml:space="preserve">El sistema propone centralizar en una única plataforma las fichas de personas, domicilios, procedimientos y documentación, mantenerlas vinculadas entre sí de manera permanente, y controlar mediante roles y auditoría quién accede a cada dato. El presente documento reúne el diseño funcional completo del sistema — sus módulos, la estructura de su base de datos y su esquema de seguridad — elaborado sobre tecnologías estándar y sin costos, de modo que el desarrollo puede encararse con recursos propios.</w:t>
       </w:r>
     </w:p>
     <w:p>
@@ -217,7 +217,7 @@
           <w:sz w:val="22"/>
           <w:szCs w:val="22"/>
         </w:rPr>
-        <w:t xml:space="preserve">Reconstruir el historial de una persona (actuaciones previas, domicilios que utilizó, con quién fue vinculada) exige revisar expedientes uno por uno.</w:t>
+        <w:t xml:space="preserve">Reconstruir el historial de una persona (actuaciones previas, domicilios que utilizó, con quién fue vinculada) exige revisar registros aislados uno por uno.</w:t>
       </w:r>
     </w:p>
     <w:p>
@@ -247,7 +247,7 @@
           <w:sz w:val="22"/>
           <w:szCs w:val="22"/>
         </w:rPr>
-        <w:t xml:space="preserve">ARDIP nace para convertir esa información dispersa en una memoria institucional: un registro único, ordenado y consultable, que crece con cada actuación y queda disponible para las que vengan.</w:t>
+        <w:t xml:space="preserve">ARDIP nace para convertir esa información dispersa en una memoria institucional: un registro único, ordenado y consultable, que crezca con cada actuación y quede disponible para las que vengan.</w:t>
       </w:r>
     </w:p>
     <w:p>
@@ -276,7 +276,7 @@
           <w:sz w:val="22"/>
           <w:szCs w:val="22"/>
         </w:rPr>
-        <w:t xml:space="preserve">Se proyecta como una aplicación web de uso interno, accesible desde cualquier computadora o teléfono de la dependencia mediante usuario y contraseña. No requiere instalación en cada equipo: funciona sobre un servidor propio y se adapta automáticamente a pantallas de escritorio y móviles, de modo que puede consultarse tanto en la oficina como durante tareas en la calle.</w:t>
+        <w:t xml:space="preserve">Se proyecta como una aplicación web de uso interno, accesible desde cualquier computadora o teléfono de la dependencia mediante usuario y contraseña. No requerirá instalación en cada equipo: funcionará sobre un servidor propio y se adaptará automáticamente a pantallas de escritorio y móviles, de modo que podrá consultarse tanto en la oficina como durante tareas en la calle.</w:t>
       </w:r>
     </w:p>
     <w:p>
@@ -289,7 +289,7 @@
           <w:sz w:val="22"/>
           <w:szCs w:val="22"/>
         </w:rPr>
-        <w:t xml:space="preserve">El diseño se apoya en tecnologías de uso masivo y probado (Laravel, MySQL, arquitectura web estándar), lo que garantiza mantenimiento sencillo, posibilidad de crecimiento por módulos y costo cero en licencias de software.</w:t>
+        <w:t xml:space="preserve">El diseño se apoya en tecnologías de uso masivo y probado (Laravel, MySQL, arquitectura web estándar), lo que garantizará mantenimiento sencillo, posibilidad de crecimiento por módulos y costo cero en licencias de software.</w:t>
       </w:r>
     </w:p>
     <w:p>
@@ -351,7 +351,7 @@
           <w:sz w:val="18"/>
           <w:szCs w:val="18"/>
         </w:rPr>
-        <w:t xml:space="preserve">Figura 1 – Esquema de funcionamiento: los usuarios acceden por red interna al servidor, que concentra la base de datos y la auditoría.</w:t>
+        <w:t xml:space="preserve">Figura 1 – Esquema de funcionamiento propuesto: los usuarios accederán por red interna al servidor, que concentrará la base de datos y la auditoría.</w:t>
       </w:r>
     </w:p>
     <w:p>
@@ -380,7 +380,7 @@
           <w:sz w:val="22"/>
           <w:szCs w:val="22"/>
         </w:rPr>
-        <w:t xml:space="preserve">El diseño funcional contempla los siguientes módulos:</w:t>
+        <w:t xml:space="preserve">El diseño funcional contempla los siguientes módulos a desarrollar:</w:t>
       </w:r>
     </w:p>
     <w:tbl>
@@ -507,7 +507,7 @@
                 <w:sz w:val="20"/>
                 <w:szCs w:val="20"/>
               </w:rPr>
-              <w:t xml:space="preserve">Ficha completa de cada persona de interés: datos filiatorios, fotografía, documentación asociada, alias o apodos conocidos y su historial de domicilios. Toda persona cargada queda disponible para búsquedas futuras.</w:t>
+              <w:t xml:space="preserve">Ficha completa de cada persona de interés: datos filiatorios, fotografía, documentación asociada, alias o apodos conocidos y su historial de domicilios. Toda persona cargada quedará disponible para búsquedas futuras.</w:t>
             </w:r>
           </w:p>
         </w:tc>
@@ -563,7 +563,7 @@
                 <w:sz w:val="20"/>
                 <w:szCs w:val="20"/>
               </w:rPr>
-              <w:t xml:space="preserve">Registro acumulativo de domicilios con geolocalización en mapa interactivo. Un mismo domicilio puede quedar vinculado a distintas personas y actuaciones a lo largo del tiempo, lo que permite detectar coincidencias que a simple vista pasarían inadvertidas.</w:t>
+              <w:t xml:space="preserve">Registro acumulativo de domicilios con geolocalización en mapa interactivo. Un mismo domicilio podrá quedar vinculado a distintas personas y actuaciones a lo largo del tiempo, lo que permitirá detectar coincidencias que a simple vista pasarían inadvertidas.</w:t>
             </w:r>
           </w:p>
         </w:tc>
@@ -673,7 +673,7 @@
                 <w:sz w:val="20"/>
                 <w:szCs w:val="20"/>
               </w:rPr>
-              <w:t xml:space="preserve">Almacenamiento seguro y ordenado de documentación (oficios, informes, actas), asociada a las fichas correspondientes, evitando la dispersión en papeles y carpetas personales.</w:t>
+              <w:t xml:space="preserve">Almacenamiento seguro y ordenado de documentación disponible (Actas de allanamiento, memos de entrevistas, inspecciones oculares, distintas actas en blanco, leyes vigentes como la 941-R), evitando la dispersión en papeles y carpetas personales.</w:t>
             </w:r>
           </w:p>
         </w:tc>
@@ -701,7 +701,7 @@
                 <w:sz w:val="20"/>
                 <w:szCs w:val="20"/>
               </w:rPr>
-              <w:t xml:space="preserve">Brigadas y UFIs</w:t>
+              <w:t xml:space="preserve">Panel de indicadores</w:t>
             </w:r>
           </w:p>
         </w:tc>
@@ -727,7 +727,7 @@
                 <w:sz w:val="20"/>
                 <w:szCs w:val="20"/>
               </w:rPr>
-              <w:t xml:space="preserve">Catálogos administrativos que permiten organizar el trabajo por equipo y por unidad fiscal, y filtrar la información según la dependencia que la generó.</w:t>
+              <w:t xml:space="preserve">Tablero con estadísticas del trabajo cargado: cantidad de procedimientos, personas registradas, actividad por brigada y por período.</w:t>
             </w:r>
           </w:p>
         </w:tc>
@@ -756,7 +756,7 @@
                 <w:sz w:val="20"/>
                 <w:szCs w:val="20"/>
               </w:rPr>
-              <w:t xml:space="preserve">Panel de indicadores</w:t>
+              <w:t xml:space="preserve">Usuarios y auditoría</w:t>
             </w:r>
           </w:p>
         </w:tc>
@@ -764,60 +764,6 @@
           <w:tcPr>
             <w:tcW w:type="dxa" w:w="6760"/>
             <w:shd w:fill="F2F4F8" w:val="clear"/>
-            <w:tcMar>
-              <w:top w:type="dxa" w:w="80"/>
-              <w:left w:type="dxa" w:w="120"/>
-              <w:bottom w:type="dxa" w:w="80"/>
-              <w:right w:type="dxa" w:w="120"/>
-            </w:tcMar>
-          </w:tcPr>
-          <w:p>
-            <w:pPr>
-              <w:spacing w:after="0"/>
-            </w:pPr>
-            <w:r>
-              <w:rPr>
-                <w:b w:val="false"/>
-                <w:bCs w:val="false"/>
-                <w:color w:val="000000"/>
-                <w:sz w:val="20"/>
-                <w:szCs w:val="20"/>
-              </w:rPr>
-              <w:t xml:space="preserve">Tablero con estadísticas del trabajo cargado: cantidad de procedimientos, personas registradas, actividad por brigada y por período.</w:t>
-            </w:r>
-          </w:p>
-        </w:tc>
-      </w:tr>
-      <w:tr>
-        <w:tc>
-          <w:tcPr>
-            <w:tcW w:type="dxa" w:w="2600"/>
-            <w:tcMar>
-              <w:top w:type="dxa" w:w="80"/>
-              <w:left w:type="dxa" w:w="120"/>
-              <w:bottom w:type="dxa" w:w="80"/>
-              <w:right w:type="dxa" w:w="120"/>
-            </w:tcMar>
-          </w:tcPr>
-          <w:p>
-            <w:pPr>
-              <w:spacing w:after="0"/>
-            </w:pPr>
-            <w:r>
-              <w:rPr>
-                <w:b/>
-                <w:bCs/>
-                <w:color w:val="000000"/>
-                <w:sz w:val="20"/>
-                <w:szCs w:val="20"/>
-              </w:rPr>
-              <w:t xml:space="preserve">Usuarios y auditoría</w:t>
-            </w:r>
-          </w:p>
-        </w:tc>
-        <w:tc>
-          <w:tcPr>
-            <w:tcW w:type="dxa" w:w="6760"/>
             <w:tcMar>
               <w:top w:type="dxa" w:w="80"/>
               <w:left w:type="dxa" w:w="120"/>
@@ -874,7 +820,7 @@
           <w:sz w:val="22"/>
           <w:szCs w:val="22"/>
         </w:rPr>
-        <w:t xml:space="preserve">El corazón del diseño es su modelo de datos: define qué se registra de cada entidad y, sobre todo, cómo se relacionan entre sí. El siguiente esquema resume las entidades principales y sus vínculos:</w:t>
+        <w:t xml:space="preserve">El modelo de datos: define qué se registra de cada entidad y, sobre todo, cómo se relacionan entre sí. El siguiente esquema resume las entidades principales y sus vínculos:</w:t>
       </w:r>
     </w:p>
     <w:p>
@@ -949,7 +895,7 @@
           <w:sz w:val="22"/>
           <w:szCs w:val="22"/>
         </w:rPr>
-        <w:t xml:space="preserve">Los puntos clave de esta estructura, explicados en lenguaje llano:</w:t>
+        <w:t xml:space="preserve">Los puntos clave de esta estructura:</w:t>
       </w:r>
     </w:p>
     <w:p>
@@ -966,7 +912,7 @@
           <w:sz w:val="22"/>
           <w:szCs w:val="22"/>
         </w:rPr>
-        <w:t xml:space="preserve">Una persona puede tener varios alias, varios domicilios y figurar en varios procedimientos; y a la inversa, un procedimiento o un domicilio pueden involucrar a varias personas. Estas relaciones “de muchos a muchos” son las que permiten los cruces de información.</w:t>
+        <w:t xml:space="preserve">Una persona puede tener varios alias, varios domicilios y figurar en varios procedimientos; y a la inversa, un procedimiento o un domicilio pueden involucrar a varias personas. Estas relaciones “de muchos a muchos” son las que permitirán los cruces de información.</w:t>
       </w:r>
     </w:p>
     <w:p>
@@ -983,7 +929,7 @@
           <w:sz w:val="22"/>
           <w:szCs w:val="22"/>
         </w:rPr>
-        <w:t xml:space="preserve">El vínculo entre una persona y un procedimiento no es un simple tilde: guarda la situación procesal (detenido, notificado, no hallado) y si registra pedido de captura.</w:t>
+        <w:t xml:space="preserve">El vínculo entre una persona y un procedimiento no será un simple tilde: guardará la situación procesal (detenido, notificado, no hallado).</w:t>
       </w:r>
     </w:p>
     <w:p>
@@ -1000,7 +946,7 @@
           <w:sz w:val="22"/>
           <w:szCs w:val="22"/>
         </w:rPr>
-        <w:t xml:space="preserve">El vínculo entre una persona y un domicilio guarda el período (desde / hasta) y si se trata de su domicilio habitual, construyendo el historial de lugares que utilizó a lo largo del tiempo.</w:t>
+        <w:t xml:space="preserve">El vínculo entre una persona y un domicilio construirá el historial de lugares que utilizó a lo largo del tiempo.</w:t>
       </w:r>
     </w:p>
     <w:p>
@@ -1017,7 +963,7 @@
           <w:sz w:val="22"/>
           <w:szCs w:val="22"/>
         </w:rPr>
-        <w:t xml:space="preserve">Cada procedimiento registra su legajo fiscal, carátula, UFI y brigada interviniente, las órdenes libradas (allanamiento, secuestro, detención) y sus resultados, quedando asociado al usuario que lo cargó.</w:t>
+        <w:t xml:space="preserve">Cada procedimiento registrará su legajo fiscal, carátula, UFI y brigada interviniente, las órdenes libradas (allanamiento, secuestro, detención) y sus resultados, quedando asociado al usuario que lo cargue.</w:t>
       </w:r>
     </w:p>
     <w:p>
@@ -1034,7 +980,7 @@
           <w:sz w:val="22"/>
           <w:szCs w:val="22"/>
         </w:rPr>
-        <w:t xml:space="preserve">Los domicilios guardan coordenadas geográficas, lo que habilita su visualización en mapa y el futuro análisis por zonas.</w:t>
+        <w:t xml:space="preserve">Los domicilios guardarán coordenadas geográficas, lo que habilitará su visualización en mapa y el futuro análisis por zonas.</w:t>
       </w:r>
     </w:p>
     <w:p>
@@ -1047,7 +993,7 @@
           <w:sz w:val="22"/>
           <w:szCs w:val="22"/>
         </w:rPr>
-        <w:t xml:space="preserve">Esta estructura está definida a nivel de tablas, campos y claves en la documentación técnica del proyecto, lista para ser implementada en el motor de base de datos.</w:t>
+        <w:t xml:space="preserve">Esta estructura está definida a nivel de tablas, campos y claves en la documentación técnica del proyecto.</w:t>
       </w:r>
     </w:p>
     <w:p>
@@ -1076,7 +1022,7 @@
           <w:sz w:val="22"/>
           <w:szCs w:val="22"/>
         </w:rPr>
-        <w:t xml:space="preserve">La característica que distingue a ARDIP de una simple planilla es que ningún dato queda aislado. Cada persona, domicilio, procedimiento y documento se relaciona con los demás, y esas relaciones se conservan en el tiempo. En la práctica, esto significa que:</w:t>
+        <w:t xml:space="preserve">La característica particular es que ningún dato quedará aislado. Cada persona, domicilio, procedimiento y documento se relacionará con los demás, y esas relaciones se conservarán en el tiempo. En la práctica, esto significa que:</w:t>
       </w:r>
     </w:p>
     <w:p>
@@ -1093,7 +1039,7 @@
           <w:sz w:val="22"/>
           <w:szCs w:val="22"/>
         </w:rPr>
-        <w:t xml:space="preserve">Al cargar una nueva actuación, el sistema permite verificar de inmediato si las personas o domicilios involucrados ya registran antecedentes de carga en otras actuaciones.</w:t>
+        <w:t xml:space="preserve">Al cargar una nueva actuación, el sistema permitirá verificar de inmediato si las personas o domicilios involucrados ya registran antecedentes de carga en otras actuaciones.</w:t>
       </w:r>
     </w:p>
     <w:p>
@@ -1110,7 +1056,7 @@
           <w:sz w:val="22"/>
           <w:szCs w:val="22"/>
         </w:rPr>
-        <w:t xml:space="preserve">La ficha de una persona muestra su historial completo: alias, fotografías, documentación, domicilios utilizados a lo largo del tiempo y procedimientos en los que fue vinculada.</w:t>
+        <w:t xml:space="preserve">La ficha de una persona mostrará su historial completo: alias, fotografías, documentación, domicilios utilizados a lo largo del tiempo y procedimientos en los que fue vinculada.</w:t>
       </w:r>
     </w:p>
     <w:p>
@@ -1127,7 +1073,7 @@
           <w:sz w:val="22"/>
           <w:szCs w:val="22"/>
         </w:rPr>
-        <w:t xml:space="preserve">Un domicilio conserva el registro de todas las personas y actuaciones asociadas a él, aun cuando pertenezcan a causas distintas y distantes en el tiempo.</w:t>
+        <w:t xml:space="preserve">Un domicilio conservará el registro de todas las personas y actuaciones asociadas a él, aun cuando pertenezcan a causas distintas y distantes en el tiempo.</w:t>
       </w:r>
     </w:p>
     <w:p>
@@ -1144,24 +1090,7 @@
           <w:sz w:val="22"/>
           <w:szCs w:val="22"/>
         </w:rPr>
-        <w:t xml:space="preserve">Las búsquedas por nombre, apodo, documento o dirección devuelven resultados en segundos, sobre toda la información histórica cargada.</w:t>
-      </w:r>
-    </w:p>
-    <w:p>
-      <w:pPr>
-        <w:pStyle w:val="ListParagraph"/>
-        <w:numPr>
-          <w:ilvl w:val="0"/>
-          <w:numId w:val="2"/>
-        </w:numPr>
-        <w:spacing w:after="80"/>
-      </w:pPr>
-      <w:r>
-        <w:rPr>
-          <w:sz w:val="22"/>
-          <w:szCs w:val="22"/>
-        </w:rPr>
-        <w:t xml:space="preserve">El sistema emite un aviso automático de coincidencia cuando se carga una persona, un alias o un domicilio que ya figura registrado en actuaciones anteriores, alertando al investigador de una posible conexión entre hechos.</w:t>
+        <w:t xml:space="preserve">Las búsquedas por nombre, apodo, documento o dirección devolverán resultados en segundos, sobre toda la información histórica cargada.</w:t>
       </w:r>
     </w:p>
     <w:p>
@@ -1174,7 +1103,7 @@
           <w:sz w:val="22"/>
           <w:szCs w:val="22"/>
         </w:rPr>
-        <w:t xml:space="preserve">De esta forma, cada actuación que se carga no solo documenta un hecho: enriquece la base sobre la que se apoyarán las investigaciones siguientes. La información deja de perderse al cierre de cada causa y pasa a producir valor de manera permanente.</w:t>
+        <w:t xml:space="preserve">De esta forma, cada actuación que se cargue no solo documentará un hecho: enriquecerá la base sobre la que se apoyarán las investigaciones siguientes. La información dejará de perderse al cierre de cada causa y pasará a producir valor de manera permanente.</w:t>
       </w:r>
     </w:p>
     <w:p>
@@ -1236,7 +1165,7 @@
           <w:sz w:val="18"/>
           <w:szCs w:val="18"/>
         </w:rPr>
-        <w:t xml:space="preserve">Figura 3 – Circuito de la información: lo cargado en cada actuación queda disponible para todas las siguientes.</w:t>
+        <w:t xml:space="preserve">Figura 3 – Circuito de la información: lo cargado en cada actuación quedará disponible para todas las siguientes.</w:t>
       </w:r>
     </w:p>
     <w:p>
@@ -1579,302 +1508,7 @@
           <w:sz w:val="22"/>
           <w:szCs w:val="22"/>
         </w:rPr>
-        <w:t xml:space="preserve">Además de los roles, el sistema registra automáticamente cada acción realizada: qué usuario la hizo, sobre qué registro, en qué momento y desde qué dispositivo. Esta auditoría permanente permite responder en cualquier momento quién accedió a determinada información, condición indispensable para que una base de datos de este tipo pueda incorporarse formalmente al trabajo de una dependencia policial y eventualmente recibir información de otros organismos mediante los convenios que correspondan.</w:t>
-      </w:r>
-    </w:p>
-    <w:p>
-      <w:pPr>
-        <w:pStyle w:val="Heading1"/>
-        <w:spacing w:after="160" w:before="320"/>
-      </w:pPr>
-      <w:r>
-        <w:rPr>
-          <w:b/>
-          <w:bCs/>
-          <w:color w:val="1F3864"/>
-          <w:sz w:val="28"/>
-          <w:szCs w:val="28"/>
-        </w:rPr>
-        <w:t xml:space="preserve">8. Líneas de evolución previstas</w:t>
-      </w:r>
-    </w:p>
-    <w:p>
-      <w:pPr>
-        <w:spacing w:after="160" w:line="300"/>
-        <w:jc w:val="both"/>
-      </w:pPr>
-      <w:r>
-        <w:rPr>
-          <w:sz w:val="22"/>
-          <w:szCs w:val="22"/>
-        </w:rPr>
-        <w:t xml:space="preserve">La arquitectura fue pensada para crecer por módulos, de manera que el sistema pueda ponerse en servicio con las funciones básicas y ampliarse en etapas. Las ampliaciones previstas en la documentación del proyecto incluyen:</w:t>
-      </w:r>
-    </w:p>
-    <w:p>
-      <w:pPr>
-        <w:pStyle w:val="ListParagraph"/>
-        <w:numPr>
-          <w:ilvl w:val="0"/>
-          <w:numId w:val="2"/>
-        </w:numPr>
-        <w:spacing w:after="80"/>
-      </w:pPr>
-      <w:r>
-        <w:rPr>
-          <w:sz w:val="22"/>
-          <w:szCs w:val="22"/>
-        </w:rPr>
-        <w:t xml:space="preserve">Registro de vehículos y de abonados telefónicos como nuevas entidades vinculables a personas, domicilios y actuaciones.</w:t>
-      </w:r>
-    </w:p>
-    <w:p>
-      <w:pPr>
-        <w:pStyle w:val="ListParagraph"/>
-        <w:numPr>
-          <w:ilvl w:val="0"/>
-          <w:numId w:val="2"/>
-        </w:numPr>
-        <w:spacing w:after="80"/>
-      </w:pPr>
-      <w:r>
-        <w:rPr>
-          <w:sz w:val="22"/>
-          <w:szCs w:val="22"/>
-        </w:rPr>
-        <w:t xml:space="preserve">Visualización gráfica de vínculos entre personas, domicilios, vehículos y hechos, para facilitar el análisis de casos complejos y la reconstrucción del funcionamiento de grupos delictivos.</w:t>
-      </w:r>
-    </w:p>
-    <w:p>
-      <w:pPr>
-        <w:pStyle w:val="ListParagraph"/>
-        <w:numPr>
-          <w:ilvl w:val="0"/>
-          <w:numId w:val="2"/>
-        </w:numPr>
-        <w:spacing w:after="80"/>
-      </w:pPr>
-      <w:r>
-        <w:rPr>
-          <w:sz w:val="22"/>
-          <w:szCs w:val="22"/>
-        </w:rPr>
-        <w:t xml:space="preserve">Generación automática de cronologías: línea de tiempo de las actuaciones, hechos y datos asociados a una persona o a un grupo de personas.</w:t>
-      </w:r>
-    </w:p>
-    <w:p>
-      <w:pPr>
-        <w:pStyle w:val="ListParagraph"/>
-        <w:numPr>
-          <w:ilvl w:val="0"/>
-          <w:numId w:val="2"/>
-        </w:numPr>
-        <w:spacing w:after="80"/>
-      </w:pPr>
-      <w:r>
-        <w:rPr>
-          <w:sz w:val="22"/>
-          <w:szCs w:val="22"/>
-        </w:rPr>
-        <w:t xml:space="preserve">Módulo de tareas de campo: registro de las diligencias encomendadas al personal (vigilancias, relevamientos, entrevistas) y de sus resultados, con el material fotográfico o fílmico obtenido asociado directamente a las fichas correspondientes.</w:t>
-      </w:r>
-    </w:p>
-    <w:p>
-      <w:pPr>
-        <w:pStyle w:val="ListParagraph"/>
-        <w:numPr>
-          <w:ilvl w:val="0"/>
-          <w:numId w:val="2"/>
-        </w:numPr>
-        <w:spacing w:after="80"/>
-      </w:pPr>
-      <w:r>
-        <w:rPr>
-          <w:sz w:val="22"/>
-          <w:szCs w:val="22"/>
-        </w:rPr>
-        <w:t xml:space="preserve">Análisis geográfico: mapas de calor de hechos y domicilios de interés, para orientar tareas investigativas y de prevención por zona.</w:t>
-      </w:r>
-    </w:p>
-    <w:p>
-      <w:pPr>
-        <w:pStyle w:val="ListParagraph"/>
-        <w:numPr>
-          <w:ilvl w:val="0"/>
-          <w:numId w:val="2"/>
-        </w:numPr>
-        <w:spacing w:after="80"/>
-      </w:pPr>
-      <w:r>
-        <w:rPr>
-          <w:sz w:val="22"/>
-          <w:szCs w:val="22"/>
-        </w:rPr>
-        <w:t xml:space="preserve">Canal de recepción de información aportada por comisarías y otras unidades operativas, para su evaluación e incorporación ordenada a la base.</w:t>
-      </w:r>
-    </w:p>
-    <w:p>
-      <w:pPr>
-        <w:pStyle w:val="ListParagraph"/>
-        <w:numPr>
-          <w:ilvl w:val="0"/>
-          <w:numId w:val="2"/>
-        </w:numPr>
-        <w:spacing w:after="80"/>
-      </w:pPr>
-      <w:r>
-        <w:rPr>
-          <w:sz w:val="22"/>
-          <w:szCs w:val="22"/>
-        </w:rPr>
-        <w:t xml:space="preserve">Reportes consolidados orientados a la presentación de resultados ante las unidades fiscales, incluyendo informes de vínculos y antecedentes de carga listos para acompañar solicitudes de medidas judiciales.</w:t>
-      </w:r>
-    </w:p>
-    <w:p>
-      <w:pPr>
-        <w:pStyle w:val="ListParagraph"/>
-        <w:numPr>
-          <w:ilvl w:val="0"/>
-          <w:numId w:val="2"/>
-        </w:numPr>
-        <w:spacing w:after="80"/>
-      </w:pPr>
-      <w:r>
-        <w:rPr>
-          <w:sz w:val="22"/>
-          <w:szCs w:val="22"/>
-        </w:rPr>
-        <w:t xml:space="preserve">Incorporación de información proveniente de otros organismos y registros públicos, a medida que se formalicen los convenios institucionales que lo habiliten.</w:t>
-      </w:r>
-    </w:p>
-    <w:p>
-      <w:pPr>
-        <w:pStyle w:val="ListParagraph"/>
-        <w:numPr>
-          <w:ilvl w:val="0"/>
-          <w:numId w:val="2"/>
-        </w:numPr>
-        <w:spacing w:after="80"/>
-      </w:pPr>
-      <w:r>
-        <w:rPr>
-          <w:sz w:val="22"/>
-          <w:szCs w:val="22"/>
-        </w:rPr>
-        <w:t xml:space="preserve">Consulta e intercambio de información con otras dependencias de la fuerza — e incluso con fuerzas de otras jurisdicciones —, manteniendo la trazabilidad de cada acceso.</w:t>
-      </w:r>
-    </w:p>
-    <w:p>
-      <w:pPr>
-        <w:pStyle w:val="Heading1"/>
-        <w:spacing w:after="160" w:before="320"/>
-      </w:pPr>
-      <w:r>
-        <w:rPr>
-          <w:b/>
-          <w:bCs/>
-          <w:color w:val="1F3864"/>
-          <w:sz w:val="28"/>
-          <w:szCs w:val="28"/>
-        </w:rPr>
-        <w:t xml:space="preserve">9. Viabilidad</w:t>
-      </w:r>
-    </w:p>
-    <w:p>
-      <w:pPr>
-        <w:spacing w:after="160" w:line="300"/>
-        <w:jc w:val="both"/>
-      </w:pPr>
-      <w:r>
-        <w:rPr>
-          <w:sz w:val="22"/>
-          <w:szCs w:val="22"/>
-        </w:rPr>
-        <w:t xml:space="preserve">El proyecto no parte de cero: la etapa de análisis y diseño se encuentra completa y documentada — estructura de la base de datos, definición de módulos, roles de acceso y esquema de auditoría —, que es la parte del trabajo donde este tipo de iniciativas suele trabarse. Con ese diseño resuelto, el desarrollo puede encararse por etapas: poner en servicio primero la carga y consulta de personas, domicilios y procedimientos, y agregar el resto de los módulos de forma gradual, mostrando resultados desde el primer tramo.</w:t>
-      </w:r>
-    </w:p>
-    <w:p>
-      <w:pPr>
-        <w:spacing w:after="160" w:line="300"/>
-        <w:jc w:val="both"/>
-      </w:pPr>
-      <w:r>
-        <w:rPr>
-          <w:sz w:val="22"/>
-          <w:szCs w:val="22"/>
-        </w:rPr>
-        <w:t xml:space="preserve">Las tecnologías elegidas son gratuitas y de uso masivo, por lo que la implementación requiere únicamente un servidor estándar (o una computadora destinada a tal fin), sin licencias pagas ni equipamiento especial. La interfaz está pensada para el uso policial cotidiano, completamente en español, con lo cual la capacitación del personal es mínima. Y por tratarse de un desarrollo propio de la fuerza, el sistema puede adaptarse con rapidez a las necesidades de la dependencia que lo adopte, sin depender de proveedores externos.</w:t>
-      </w:r>
-    </w:p>
-    <w:p>
-      <w:pPr>
-        <w:pStyle w:val="Heading1"/>
-        <w:spacing w:after="160" w:before="320"/>
-      </w:pPr>
-      <w:r>
-        <w:rPr>
-          <w:b/>
-          <w:bCs/>
-          <w:color w:val="1F3864"/>
-          <w:sz w:val="28"/>
-          <w:szCs w:val="28"/>
-        </w:rPr>
-        <w:t xml:space="preserve">10. Conclusión</w:t>
-      </w:r>
-    </w:p>
-    <w:p>
-      <w:pPr>
-        <w:spacing w:after="160" w:line="300"/>
-        <w:jc w:val="both"/>
-      </w:pPr>
-      <w:r>
-        <w:rPr>
-          <w:sz w:val="22"/>
-          <w:szCs w:val="22"/>
-        </w:rPr>
-        <w:t xml:space="preserve">El trabajo investigativo produce todos los días información valiosa que hoy se pierde por falta de una herramienta que la conserve, la relacione y la proteja. ARDIP fue concebido para cubrir exactamente ese vacío: transformar los datos sueltos de cada actuación en una base de conocimiento permanente, consultable y auditada, que potencie cada nueva investigación con todo lo aprendido en las anteriores.</w:t>
-      </w:r>
-    </w:p>
-    <w:p>
-      <w:pPr>
-        <w:spacing w:after="160" w:line="300"/>
-        <w:jc w:val="both"/>
-      </w:pPr>
-      <w:r>
-        <w:rPr>
-          <w:sz w:val="22"/>
-          <w:szCs w:val="22"/>
-        </w:rPr>
-        <w:t xml:space="preserve">Se pone esta documentación a disposición como aporte para cualquier iniciativa institucional orientada a fortalecer la investigación criminal, en la convicción de que contar con el soporte informático adecuado es condición necesaria para que ese fortalecimiento sea real y sostenible en el tiempo.</w:t>
-      </w:r>
-    </w:p>
-    <w:p>
-      <w:pPr>
-        <w:spacing w:before="300"/>
-      </w:pPr>
-    </w:p>
-    <w:p>
-      <w:pPr>
-        <w:spacing w:before="100"/>
-      </w:pPr>
-      <w:r>
-        <w:rPr>
-          <w:b/>
-          <w:bCs/>
-          <w:sz w:val="22"/>
-          <w:szCs w:val="22"/>
-        </w:rPr>
-        <w:t xml:space="preserve">Flores, Maximiliano</w:t>
-      </w:r>
-    </w:p>
-    <w:p>
-      <w:r>
-        <w:rPr>
-          <w:color w:val="595959"/>
-          <w:sz w:val="22"/>
-          <w:szCs w:val="22"/>
-        </w:rPr>
-        <w:t xml:space="preserve">Autor del proyecto ARDIP</w:t>
+        <w:t xml:space="preserve">Además de los roles, el sistema registrará automáticamente cada acción realizada: qué usuario la hizo, sobre qué registro, en qué momento y desde qué dispositivo. Esta auditoría permanente permitirá responder en cualquier momento quién accedió a determinada información, condición indispensable para que una base de datos de este tipo pueda incorporarse formalmente al trabajo de una dependencia policial y eventualmente recibir información de otros organismos mediante los convenios que correspondan.</w:t>
       </w:r>
     </w:p>
     <w:sectPr>

</xml_diff>

<commit_message>
docs: dar tono informal al documento de diseño de ARDIP
Se reescribe todo el texto en registro llano y con primera persona,
como notas de trabajo del autor: títulos coloquiales, frases directas
y tablas con encabezados simples (Para qué sirve / Qué puede hacer).

Co-Authored-By: Claude Fable 5 <noreply@anthropic.com>
Claude-Session: https://claude.ai/code/session_01PXFtVC1rBgo8dCza5yvnRY
</commit_message>
<xml_diff>
--- a/docs/presentacion/ARDIP - Anteproyecto del Sistema.docx
+++ b/docs/presentacion/ARDIP - Anteproyecto del Sistema.docx
@@ -45,7 +45,7 @@
           <w:sz w:val="22"/>
           <w:szCs w:val="22"/>
         </w:rPr>
-        <w:t xml:space="preserve">Anteproyecto – Diseño funcional del sistema</w:t>
+        <w:t xml:space="preserve">Documento de trabajo – Diseño del sistema</w:t>
       </w:r>
     </w:p>
     <w:p>
@@ -111,7 +111,7 @@
           <w:sz w:val="28"/>
           <w:szCs w:val="28"/>
         </w:rPr>
-        <w:t xml:space="preserve">1. Resumen ejecutivo</w:t>
+        <w:t xml:space="preserve">1. La idea</w:t>
       </w:r>
     </w:p>
     <w:p>
@@ -124,7 +124,7 @@
           <w:sz w:val="22"/>
           <w:szCs w:val="22"/>
         </w:rPr>
-        <w:t xml:space="preserve">ARDIP es un proyecto de sistema informático concebido desde la propia experiencia del trabajo en brigada, pensado para resolver un problema concreto de la tarea investigativa: la información que se produce en cada actuación queda dispersa, se pierde cuando la causa se cierra y no puede aprovecharse en investigaciones futuras.</w:t>
+        <w:t xml:space="preserve">ARDIP nace de algo que veo todos los días trabajando en brigada: en cada actuación se junta información valiosa que después queda desparramada, y cuando la causa se cierra, esa información se pierde. Nadie la vuelve a mirar, aunque muchas veces serviría para lo que viene después.</w:t>
       </w:r>
     </w:p>
     <w:p>
@@ -137,7 +137,7 @@
           <w:sz w:val="22"/>
           <w:szCs w:val="22"/>
         </w:rPr>
-        <w:t xml:space="preserve">El sistema propone centralizar en una única plataforma las fichas de personas, domicilios, procedimientos y documentación, mantenerlas vinculadas entre sí de manera permanente, y controlar mediante roles y auditoría quién accede a cada dato. El presente documento reúne el diseño funcional completo del sistema — sus módulos, la estructura de su base de datos y su esquema de seguridad — elaborado sobre tecnologías estándar y sin costos, de modo que el desarrollo puede encararse con recursos propios.</w:t>
+        <w:t xml:space="preserve">La idea es armar un sistema donde todo eso quede guardado en un solo lugar: las fichas de personas, los domicilios, los procedimientos y los documentos, todo conectado entre sí y con control de quién ve qué cosa. En este documento dejo armado el diseño completo — los módulos, cómo se organiza la base de datos y el esquema de seguridad — usando herramientas gratuitas, así el desarrollo se puede encarar con lo que hay.</w:t>
       </w:r>
     </w:p>
     <w:p>
@@ -153,7 +153,7 @@
           <w:sz w:val="28"/>
           <w:szCs w:val="28"/>
         </w:rPr>
-        <w:t xml:space="preserve">2. El problema que motivó el desarrollo</w:t>
+        <w:t xml:space="preserve">2. El problema</w:t>
       </w:r>
     </w:p>
     <w:p>
@@ -166,7 +166,7 @@
           <w:sz w:val="22"/>
           <w:szCs w:val="22"/>
         </w:rPr>
-        <w:t xml:space="preserve">En la práctica diaria de una brigada, la información de valor investigativo se registra en soportes aislados: actuaciones en papel, planillas individuales, fotografías en teléfonos personales y datos que quedan en la memoria de cada investigador. Esto genera consecuencias conocidas por todos:</w:t>
+        <w:t xml:space="preserve">Hoy la información de valor queda repartida en mil lados: actuaciones en papel, planillas que arma cada uno, fotos en el celular personal y datos que solo están en la cabeza de cada investigador. Las consecuencias las conocemos todos:</w:t>
       </w:r>
     </w:p>
     <w:p>
@@ -183,7 +183,7 @@
           <w:sz w:val="22"/>
           <w:szCs w:val="22"/>
         </w:rPr>
-        <w:t xml:space="preserve">Cuando un hecho se esclarece, la información reunida deja de consultarse, aunque muchas veces sería útil para hechos posteriores.</w:t>
+        <w:t xml:space="preserve">Se esclarece un hecho y la información que se juntó no se mira nunca más, aunque podría servir para hechos posteriores.</w:t>
       </w:r>
     </w:p>
     <w:p>
@@ -200,7 +200,7 @@
           <w:sz w:val="22"/>
           <w:szCs w:val="22"/>
         </w:rPr>
-        <w:t xml:space="preserve">Dos investigadores pueden estar trabajando sobre la misma persona o el mismo domicilio sin saberlo.</w:t>
+        <w:t xml:space="preserve">Dos investigadores pueden estar trabajando sobre la misma persona o el mismo domicilio sin enterarse.</w:t>
       </w:r>
     </w:p>
     <w:p>
@@ -217,7 +217,7 @@
           <w:sz w:val="22"/>
           <w:szCs w:val="22"/>
         </w:rPr>
-        <w:t xml:space="preserve">Reconstruir el historial de una persona (actuaciones previas, domicilios que utilizó, con quién fue vinculada) exige revisar registros aislados uno por uno.</w:t>
+        <w:t xml:space="preserve">Reconstruir el historial de alguien (en qué actuaciones apareció, qué domicilios usó, con quién se lo vinculó) obliga a revisar registros sueltos uno por uno.</w:t>
       </w:r>
     </w:p>
     <w:p>
@@ -234,7 +234,7 @@
           <w:sz w:val="22"/>
           <w:szCs w:val="22"/>
         </w:rPr>
-        <w:t xml:space="preserve">No existe un registro de quién consultó o modificó un dato, lo que dificulta el manejo responsable de información sensible.</w:t>
+        <w:t xml:space="preserve">No queda asentado quién consultó o modificó un dato, y eso complica el manejo de información sensible.</w:t>
       </w:r>
     </w:p>
     <w:p>
@@ -247,7 +247,7 @@
           <w:sz w:val="22"/>
           <w:szCs w:val="22"/>
         </w:rPr>
-        <w:t xml:space="preserve">ARDIP nace para convertir esa información dispersa en una memoria institucional: un registro único, ordenado y consultable, que crezca con cada actuación y quede disponible para las que vengan.</w:t>
+        <w:t xml:space="preserve">ARDIP apunta a convertir todo eso en una memoria de la brigada: un registro único y ordenado, donde se pueda buscar, que crezca con cada actuación y quede para las que vengan.</w:t>
       </w:r>
     </w:p>
     <w:p>
@@ -263,7 +263,7 @@
           <w:sz w:val="28"/>
           <w:szCs w:val="28"/>
         </w:rPr>
-        <w:t xml:space="preserve">3. Qué es ARDIP</w:t>
+        <w:t xml:space="preserve">3. Cómo va a funcionar</w:t>
       </w:r>
     </w:p>
     <w:p>
@@ -276,7 +276,7 @@
           <w:sz w:val="22"/>
           <w:szCs w:val="22"/>
         </w:rPr>
-        <w:t xml:space="preserve">Se proyecta como una aplicación web de uso interno, accesible desde cualquier computadora o teléfono de la dependencia mediante usuario y contraseña. No requerirá instalación en cada equipo: funcionará sobre un servidor propio y se adaptará automáticamente a pantallas de escritorio y móviles, de modo que podrá consultarse tanto en la oficina como durante tareas en la calle.</w:t>
+        <w:t xml:space="preserve">Va a ser una página web de uso interno: se entra con usuario y contraseña desde cualquier computadora o celular de la dependencia. No hay que instalar nada en cada equipo; todo corre en un servidor propio, y la pantalla se acomoda sola si se abre desde el teléfono, así se puede consultar una ficha estando en la calle.</w:t>
       </w:r>
     </w:p>
     <w:p>
@@ -289,7 +289,7 @@
           <w:sz w:val="22"/>
           <w:szCs w:val="22"/>
         </w:rPr>
-        <w:t xml:space="preserve">El diseño se apoya en tecnologías de uso masivo y probado (Laravel, MySQL, arquitectura web estándar), lo que garantizará mantenimiento sencillo, posibilidad de crecimiento por módulos y costo cero en licencias de software.</w:t>
+        <w:t xml:space="preserve">Para armarlo pienso usar herramientas conocidas y gratuitas (Laravel, MySQL, una aplicación web común y corriente): son fáciles de mantener, permiten ir agregando módulos de a poco y no hay que pagar ninguna licencia.</w:t>
       </w:r>
     </w:p>
     <w:p>
@@ -351,7 +351,7 @@
           <w:sz w:val="18"/>
           <w:szCs w:val="18"/>
         </w:rPr>
-        <w:t xml:space="preserve">Figura 1 – Esquema de funcionamiento propuesto: los usuarios accederán por red interna al servidor, que concentrará la base de datos y la auditoría.</w:t>
+        <w:t xml:space="preserve">Figura 1 – Cómo va a funcionar: se accede por la red interna al servidor, que guarda la base de datos y el registro de auditoría.</w:t>
       </w:r>
     </w:p>
     <w:p>
@@ -367,7 +367,7 @@
           <w:sz w:val="28"/>
           <w:szCs w:val="28"/>
         </w:rPr>
-        <w:t xml:space="preserve">4. Módulos del sistema</w:t>
+        <w:t xml:space="preserve">4. Los módulos del sistema</w:t>
       </w:r>
     </w:p>
     <w:p>
@@ -380,7 +380,7 @@
           <w:sz w:val="22"/>
           <w:szCs w:val="22"/>
         </w:rPr>
-        <w:t xml:space="preserve">El diseño funcional contempla los siguientes módulos a desarrollar:</w:t>
+        <w:t xml:space="preserve">El sistema se arma con estos módulos:</w:t>
       </w:r>
     </w:p>
     <w:tbl>
@@ -453,7 +453,7 @@
                 <w:sz w:val="20"/>
                 <w:szCs w:val="20"/>
               </w:rPr>
-              <w:t xml:space="preserve">Qué resuelve</w:t>
+              <w:t xml:space="preserve">Para qué sirve</w:t>
             </w:r>
           </w:p>
         </w:tc>
@@ -507,7 +507,7 @@
                 <w:sz w:val="20"/>
                 <w:szCs w:val="20"/>
               </w:rPr>
-              <w:t xml:space="preserve">Ficha completa de cada persona de interés: datos filiatorios, fotografía, documentación asociada, alias o apodos conocidos y su historial de domicilios. Toda persona cargada quedará disponible para búsquedas futuras.</w:t>
+              <w:t xml:space="preserve">La ficha de cada persona de interés: datos filiatorios, foto, documentación, alias o apodos conocidos y los domicilios que fue usando. Cada persona que se carga queda disponible para siempre en las búsquedas.</w:t>
             </w:r>
           </w:p>
         </w:tc>
@@ -563,7 +563,7 @@
                 <w:sz w:val="20"/>
                 <w:szCs w:val="20"/>
               </w:rPr>
-              <w:t xml:space="preserve">Registro acumulativo de domicilios con geolocalización en mapa interactivo. Un mismo domicilio podrá quedar vinculado a distintas personas y actuaciones a lo largo del tiempo, lo que permitirá detectar coincidencias que a simple vista pasarían inadvertidas.</w:t>
+              <w:t xml:space="preserve">Registro de domicilios que se van acumulando, con ubicación en un mapa. Un mismo domicilio puede quedar atado a distintas personas y actuaciones con el tiempo, y ahí saltan coincidencias que de otra forma nadie ve.</w:t>
             </w:r>
           </w:p>
         </w:tc>
@@ -617,7 +617,7 @@
                 <w:sz w:val="20"/>
                 <w:szCs w:val="20"/>
               </w:rPr>
-              <w:t xml:space="preserve">Carga de allanamientos y actuaciones, con vinculación directa a las personas y domicilios intervinientes y a la UFI correspondiente. Generación de reportes en PDF para acompañar la actuación judicial.</w:t>
+              <w:t xml:space="preserve">Carga de allanamientos y actuaciones, atados a las personas y domicilios que intervinieron y a la UFI que corresponde. Genera el reporte en PDF para adjuntar a la actuación judicial.</w:t>
             </w:r>
           </w:p>
         </w:tc>
@@ -673,7 +673,7 @@
                 <w:sz w:val="20"/>
                 <w:szCs w:val="20"/>
               </w:rPr>
-              <w:t xml:space="preserve">Almacenamiento seguro y ordenado de documentación disponible (Actas de allanamiento, memos de entrevistas, inspecciones oculares, distintas actas en blanco, leyes vigentes como la 941-R), evitando la dispersión en papeles y carpetas personales.</w:t>
+              <w:t xml:space="preserve">Un lugar seguro y ordenado para la documentación (actas de allanamiento, memos de entrevistas, inspecciones oculares, distintas actas en blanco, leyes vigentes como la 941-R), para no andar buscando entre papeles y carpetas de cada uno.</w:t>
             </w:r>
           </w:p>
         </w:tc>
@@ -727,7 +727,7 @@
                 <w:sz w:val="20"/>
                 <w:szCs w:val="20"/>
               </w:rPr>
-              <w:t xml:space="preserve">Tablero con estadísticas del trabajo cargado: cantidad de procedimientos, personas registradas, actividad por brigada y por período.</w:t>
+              <w:t xml:space="preserve">Tablero con los números del trabajo cargado: cuántos procedimientos, cuántas personas registradas, actividad por brigada y por período.</w:t>
             </w:r>
           </w:p>
         </w:tc>
@@ -783,7 +783,7 @@
                 <w:sz w:val="20"/>
                 <w:szCs w:val="20"/>
               </w:rPr>
-              <w:t xml:space="preserve">Administración de cuentas del personal con roles diferenciados y registro automático de cada acción realizada en el sistema (quién, qué, cuándo y desde dónde).</w:t>
+              <w:t xml:space="preserve">Cuentas del personal con distintos permisos, y registro automático de todo lo que se hace en el sistema (quién, qué, cuándo y desde dónde).</w:t>
             </w:r>
           </w:p>
         </w:tc>
@@ -807,7 +807,7 @@
           <w:sz w:val="28"/>
           <w:szCs w:val="28"/>
         </w:rPr>
-        <w:t xml:space="preserve">5. Estructura de datos</w:t>
+        <w:t xml:space="preserve">5. Cómo se organizan los datos</w:t>
       </w:r>
     </w:p>
     <w:p>
@@ -820,7 +820,7 @@
           <w:sz w:val="22"/>
           <w:szCs w:val="22"/>
         </w:rPr>
-        <w:t xml:space="preserve">El modelo de datos: define qué se registra de cada entidad y, sobre todo, cómo se relacionan entre sí. El siguiente esquema resume las entidades principales y sus vínculos:</w:t>
+        <w:t xml:space="preserve">Esta es la parte más técnica, pero es la clave de todo: definir qué se guarda de cada cosa y cómo se conecta con el resto. El esquema resume las entidades principales y sus vínculos:</w:t>
       </w:r>
     </w:p>
     <w:p>
@@ -895,7 +895,7 @@
           <w:sz w:val="22"/>
           <w:szCs w:val="22"/>
         </w:rPr>
-        <w:t xml:space="preserve">Los puntos clave de esta estructura:</w:t>
+        <w:t xml:space="preserve">Lo importante de esta estructura:</w:t>
       </w:r>
     </w:p>
     <w:p>
@@ -912,7 +912,7 @@
           <w:sz w:val="22"/>
           <w:szCs w:val="22"/>
         </w:rPr>
-        <w:t xml:space="preserve">Una persona puede tener varios alias, varios domicilios y figurar en varios procedimientos; y a la inversa, un procedimiento o un domicilio pueden involucrar a varias personas. Estas relaciones “de muchos a muchos” son las que permitirán los cruces de información.</w:t>
+        <w:t xml:space="preserve">Una persona puede tener varios alias, varios domicilios y aparecer en varios procedimientos; y al revés, un procedimiento o un domicilio pueden involucrar a varias personas. Esos vínculos “de muchos a muchos” son los que después permiten cruzar información.</w:t>
       </w:r>
     </w:p>
     <w:p>
@@ -929,7 +929,7 @@
           <w:sz w:val="22"/>
           <w:szCs w:val="22"/>
         </w:rPr>
-        <w:t xml:space="preserve">El vínculo entre una persona y un procedimiento no será un simple tilde: guardará la situación procesal (detenido, notificado, no hallado).</w:t>
+        <w:t xml:space="preserve">El vínculo entre una persona y un procedimiento no va a ser un simple tilde: va a guardar la situación procesal (detenido, notificado, no hallado).</w:t>
       </w:r>
     </w:p>
     <w:p>
@@ -946,7 +946,7 @@
           <w:sz w:val="22"/>
           <w:szCs w:val="22"/>
         </w:rPr>
-        <w:t xml:space="preserve">El vínculo entre una persona y un domicilio construirá el historial de lugares que utilizó a lo largo del tiempo.</w:t>
+        <w:t xml:space="preserve">El vínculo entre una persona y un domicilio va armando el historial de lugares que usó a lo largo del tiempo.</w:t>
       </w:r>
     </w:p>
     <w:p>
@@ -963,7 +963,7 @@
           <w:sz w:val="22"/>
           <w:szCs w:val="22"/>
         </w:rPr>
-        <w:t xml:space="preserve">Cada procedimiento registrará su legajo fiscal, carátula, UFI y brigada interviniente, las órdenes libradas (allanamiento, secuestro, detención) y sus resultados, quedando asociado al usuario que lo cargue.</w:t>
+        <w:t xml:space="preserve">Cada procedimiento va a registrar legajo fiscal, carátula, UFI y brigada que intervino, las órdenes libradas (allanamiento, secuestro, detención) y cómo salieron, y queda asociado al usuario que lo cargó.</w:t>
       </w:r>
     </w:p>
     <w:p>
@@ -980,7 +980,7 @@
           <w:sz w:val="22"/>
           <w:szCs w:val="22"/>
         </w:rPr>
-        <w:t xml:space="preserve">Los domicilios guardarán coordenadas geográficas, lo que habilitará su visualización en mapa y el futuro análisis por zonas.</w:t>
+        <w:t xml:space="preserve">Los domicilios van a guardar las coordenadas, así se ven en el mapa y más adelante se puede analizar por zonas.</w:t>
       </w:r>
     </w:p>
     <w:p>
@@ -993,7 +993,7 @@
           <w:sz w:val="22"/>
           <w:szCs w:val="22"/>
         </w:rPr>
-        <w:t xml:space="preserve">Esta estructura está definida a nivel de tablas, campos y claves en la documentación técnica del proyecto.</w:t>
+        <w:t xml:space="preserve">Todo esto ya está bajado a nivel de tablas, campos y claves en la documentación técnica del proyecto.</w:t>
       </w:r>
     </w:p>
     <w:p>
@@ -1009,7 +1009,7 @@
           <w:sz w:val="28"/>
           <w:szCs w:val="28"/>
         </w:rPr>
-        <w:t xml:space="preserve">6. El valor central: información acumulativa y vinculada</w:t>
+        <w:t xml:space="preserve">6. Lo más importante: nada queda suelto</w:t>
       </w:r>
     </w:p>
     <w:p>
@@ -1022,7 +1022,7 @@
           <w:sz w:val="22"/>
           <w:szCs w:val="22"/>
         </w:rPr>
-        <w:t xml:space="preserve">La característica particular es que ningún dato quedará aislado. Cada persona, domicilio, procedimiento y documento se relacionará con los demás, y esas relaciones se conservarán en el tiempo. En la práctica, esto significa que:</w:t>
+        <w:t xml:space="preserve">La gracia del sistema es que ningún dato queda aislado: cada persona, domicilio, procedimiento y documento queda conectado con el resto, y esas conexiones no se pierden con el tiempo. En el día a día esto significa que:</w:t>
       </w:r>
     </w:p>
     <w:p>
@@ -1039,7 +1039,7 @@
           <w:sz w:val="22"/>
           <w:szCs w:val="22"/>
         </w:rPr>
-        <w:t xml:space="preserve">Al cargar una nueva actuación, el sistema permitirá verificar de inmediato si las personas o domicilios involucrados ya registran antecedentes de carga en otras actuaciones.</w:t>
+        <w:t xml:space="preserve">Al cargar una actuación nueva se va a poder ver en el momento si las personas o los domicilios involucrados ya aparecieron en otras actuaciones.</w:t>
       </w:r>
     </w:p>
     <w:p>
@@ -1056,7 +1056,7 @@
           <w:sz w:val="22"/>
           <w:szCs w:val="22"/>
         </w:rPr>
-        <w:t xml:space="preserve">La ficha de una persona mostrará su historial completo: alias, fotografías, documentación, domicilios utilizados a lo largo del tiempo y procedimientos en los que fue vinculada.</w:t>
+        <w:t xml:space="preserve">La ficha de una persona va a mostrar todo su historial: alias, fotos, documentación, domicilios que usó y procedimientos donde fue vinculada.</w:t>
       </w:r>
     </w:p>
     <w:p>
@@ -1073,7 +1073,7 @@
           <w:sz w:val="22"/>
           <w:szCs w:val="22"/>
         </w:rPr>
-        <w:t xml:space="preserve">Un domicilio conservará el registro de todas las personas y actuaciones asociadas a él, aun cuando pertenezcan a causas distintas y distantes en el tiempo.</w:t>
+        <w:t xml:space="preserve">Un domicilio va a conservar el registro de todas las personas y actuaciones asociadas a él, aunque sean de causas distintas y de años diferentes.</w:t>
       </w:r>
     </w:p>
     <w:p>
@@ -1090,7 +1090,7 @@
           <w:sz w:val="22"/>
           <w:szCs w:val="22"/>
         </w:rPr>
-        <w:t xml:space="preserve">Las búsquedas por nombre, apodo, documento o dirección devolverán resultados en segundos, sobre toda la información histórica cargada.</w:t>
+        <w:t xml:space="preserve">Buscando por nombre, apodo, documento o dirección se va a encontrar en segundos cualquier cosa que se haya cargado, por vieja que sea.</w:t>
       </w:r>
     </w:p>
     <w:p>
@@ -1103,7 +1103,7 @@
           <w:sz w:val="22"/>
           <w:szCs w:val="22"/>
         </w:rPr>
-        <w:t xml:space="preserve">De esta forma, cada actuación que se cargue no solo documentará un hecho: enriquecerá la base sobre la que se apoyarán las investigaciones siguientes. La información dejará de perderse al cierre de cada causa y pasará a producir valor de manera permanente.</w:t>
+        <w:t xml:space="preserve">Así, cada actuación que se carga no solo documenta ese hecho: suma para las investigaciones que vienen. La información deja de perderse cuando se cierra la causa.</w:t>
       </w:r>
     </w:p>
     <w:p>
@@ -1165,7 +1165,7 @@
           <w:sz w:val="18"/>
           <w:szCs w:val="18"/>
         </w:rPr>
-        <w:t xml:space="preserve">Figura 3 – Circuito de la información: lo cargado en cada actuación quedará disponible para todas las siguientes.</w:t>
+        <w:t xml:space="preserve">Figura 3 – El circuito de la información: lo que se carga en una actuación queda servido para todas las siguientes.</w:t>
       </w:r>
     </w:p>
     <w:p>
@@ -1181,7 +1181,7 @@
           <w:sz w:val="28"/>
           <w:szCs w:val="28"/>
         </w:rPr>
-        <w:t xml:space="preserve">7. Seguridad, roles y auditoría</w:t>
+        <w:t xml:space="preserve">7. Seguridad y control de acceso</w:t>
       </w:r>
     </w:p>
     <w:p>
@@ -1194,7 +1194,7 @@
           <w:sz w:val="22"/>
           <w:szCs w:val="22"/>
         </w:rPr>
-        <w:t xml:space="preserve">Un sistema que concentra información sensible exige un control estricto de acceso. ARDIP fue diseñado desde el inicio con ese criterio, contemplando la normativa vigente en materia de protección de datos personales (Ley 25.326):</w:t>
+        <w:t xml:space="preserve">Un sistema con este tipo de información necesita control estricto de quién entra y qué puede hacer cada uno. Por eso el diseño arranca con roles bien separados, teniendo en cuenta la ley de protección de datos personales (25.326):</w:t>
       </w:r>
     </w:p>
     <w:tbl>
@@ -1267,7 +1267,7 @@
                 <w:sz w:val="20"/>
                 <w:szCs w:val="20"/>
               </w:rPr>
-              <w:t xml:space="preserve">Alcance</w:t>
+              <w:t xml:space="preserve">Qué puede hacer</w:t>
             </w:r>
           </w:p>
         </w:tc>
@@ -1321,7 +1321,7 @@
                 <w:sz w:val="20"/>
                 <w:szCs w:val="20"/>
               </w:rPr>
-              <w:t xml:space="preserve">Configuración del sistema, gestión de usuarios y acceso a la auditoría completa.</w:t>
+              <w:t xml:space="preserve">Configura el sistema, maneja los usuarios y ve toda la auditoría.</w:t>
             </w:r>
           </w:p>
         </w:tc>
@@ -1377,7 +1377,7 @@
                 <w:sz w:val="20"/>
                 <w:szCs w:val="20"/>
               </w:rPr>
-              <w:t xml:space="preserve">Gestión operativa de los módulos y supervisión del trabajo de su dependencia.</w:t>
+              <w:t xml:space="preserve">Maneja los módulos del día a día y supervisa el trabajo de su dependencia.</w:t>
             </w:r>
           </w:p>
         </w:tc>
@@ -1431,7 +1431,7 @@
                 <w:sz w:val="20"/>
                 <w:szCs w:val="20"/>
               </w:rPr>
-              <w:t xml:space="preserve">Carga y edición de personas, domicilios, procedimientos y documentación.</w:t>
+              <w:t xml:space="preserve">Carga y edita personas, domicilios, procedimientos y documentos.</w:t>
             </w:r>
           </w:p>
         </w:tc>
@@ -1487,7 +1487,7 @@
                 <w:sz w:val="20"/>
                 <w:szCs w:val="20"/>
               </w:rPr>
-              <w:t xml:space="preserve">Acceso de solo lectura para consulta de información, sin posibilidad de modificarla.</w:t>
+              <w:t xml:space="preserve">Solo puede ver y buscar; no puede modificar nada.</w:t>
             </w:r>
           </w:p>
         </w:tc>
@@ -1508,7 +1508,7 @@
           <w:sz w:val="22"/>
           <w:szCs w:val="22"/>
         </w:rPr>
-        <w:t xml:space="preserve">Además de los roles, el sistema registrará automáticamente cada acción realizada: qué usuario la hizo, sobre qué registro, en qué momento y desde qué dispositivo. Esta auditoría permanente permitirá responder en cualquier momento quién accedió a determinada información, condición indispensable para que una base de datos de este tipo pueda incorporarse formalmente al trabajo de una dependencia policial y eventualmente recibir información de otros organismos mediante los convenios que correspondan.</w:t>
+        <w:t xml:space="preserve">Aparte de los roles, el sistema va a dejar registrado todo lo que se hace: qué usuario, sobre qué registro, cuándo y desde qué equipo. Con eso siempre se puede responder quién accedió a qué información — algo indispensable si el día de mañana el sistema se incorpora formalmente al trabajo de la dependencia o recibe datos de otros organismos por convenio.</w:t>
       </w:r>
     </w:p>
     <w:sectPr>

</xml_diff>